<commit_message>
update C language Ch1-2 review with final answers
</commit_message>
<xml_diff>
--- a/notes/c-language/ch1-2/C语言第1-2章复习.docx
+++ b/notes/c-language/ch1-2/C语言第1-2章复习.docx
@@ -25,24 +25,9 @@
           <w:rFonts w:eastAsia="SimSun"/>
           <w:b w:val="0"/>
           <w:color w:val="666666"/>
-          <w:sz w:val="24"/>
+          <w:sz w:val="22"/>
         </w:rPr>
-        <w:t>吉冠佳    2026年7月5日</w:t>
-      </w:r>
-    </w:p>
-    <w:p/>
-    <w:p>
-      <w:pPr>
-        <w:jc w:val="center"/>
-      </w:pPr>
-      <w:r>
-        <w:rPr>
-          <w:rFonts w:eastAsia="SimHei"/>
-          <w:b/>
-          <w:color w:val="C80000"/>
-          <w:sz w:val="28"/>
-        </w:rPr>
-        <w:t>答对 12 题    答错 12 题    共 24 题</w:t>
+        <w:t>吉冠佳    2026年7月8日    答对12题  答错12题  共24题</w:t>
       </w:r>
     </w:p>
     <w:p/>
@@ -58,7 +43,7 @@
           <w:color w:val="003366"/>
           <w:sz w:val="36"/>
         </w:rPr>
-        <w:t>第1章 程序设计与C语言</w:t>
+        <w:t>第1章  程序设计与C语言</w:t>
       </w:r>
     </w:p>
     <w:p>
@@ -69,7 +54,7 @@
           <w:color w:val="B40000"/>
           <w:sz w:val="20"/>
         </w:rPr>
-        <w:t>答错题排在前面，答对题排在后面。</w:t>
+        <w:t>答错排前，答对排后。</w:t>
       </w:r>
     </w:p>
     <w:p/>
@@ -88,7 +73,7 @@
           <w:b w:val="0"/>
           <w:sz w:val="22"/>
         </w:rPr>
-        <w:t>main函数和大小写敏感</w:t>
+        <w:t>main函数和大小写敏感。C语言区分大小写，main是程序入口专用名。int main()的int表示返回整数给OS。</w:t>
       </w:r>
     </w:p>
     <w:p>
@@ -107,7 +92,7 @@
           <w:b w:val="0"/>
           <w:sz w:val="22"/>
         </w:rPr>
-        <w:t>main能不能写成Main？为什么？int main()的int什么意思？</w:t>
+        <w:t>main能不能写成Main？为什么？</w:t>
       </w:r>
     </w:p>
     <w:p>
@@ -147,7 +132,7 @@
           <w:color w:val="0000B4"/>
           <w:sz w:val="22"/>
         </w:rPr>
-        <w:t>大小写敏感是C基本规则。main是入口专用符号只能小写。</w:t>
+        <w:t>大小写敏感是C基本规则。main只能小写。</w:t>
       </w:r>
     </w:p>
     <w:p/>
@@ -166,7 +151,7 @@
           <w:b w:val="0"/>
           <w:sz w:val="22"/>
         </w:rPr>
-        <w:t>return 0的含义</w:t>
+        <w:t>return 0的含义。return 0返回给OS，0=正常，非0=出错。C99后可省略自动补0。printf才是输出。</w:t>
       </w:r>
     </w:p>
     <w:p>
@@ -185,7 +170,7 @@
           <w:b w:val="0"/>
           <w:sz w:val="22"/>
         </w:rPr>
-        <w:t>去掉return 0会报错吗？操作系统收到什么返回值？</w:t>
+        <w:t>去掉return 0会报错吗？OS收到什么？</w:t>
       </w:r>
     </w:p>
     <w:p>
@@ -205,7 +190,7 @@
           <w:color w:val="006400"/>
           <w:sz w:val="22"/>
         </w:rPr>
-        <w:t>不报错。C99自动补return 0，OS收到0(正常结束)。</w:t>
+        <w:t>不报错。C99自动补return 0，OS收到0。</w:t>
       </w:r>
     </w:p>
     <w:p>
@@ -225,7 +210,7 @@
           <w:color w:val="0000B4"/>
           <w:sz w:val="22"/>
         </w:rPr>
-        <w:t>return 0返回给操作系统，不是输出到屏幕。printf才是输出。</w:t>
+        <w:t>建议显式写return 0养成好习惯。return不是输出。</w:t>
       </w:r>
     </w:p>
     <w:p/>
@@ -244,7 +229,7 @@
           <w:b w:val="0"/>
           <w:sz w:val="22"/>
         </w:rPr>
-        <w:t>printf参数匹配</w:t>
+        <w:t>printf参数必须和占位符一一对应。多传忽略，少传出垃圾值(取内存旧值)，不报错。</w:t>
       </w:r>
     </w:p>
     <w:p>
@@ -283,7 +268,7 @@
           <w:color w:val="006400"/>
           <w:sz w:val="22"/>
         </w:rPr>
-        <w:t>第二个%d输出随机垃圾值(内存旧值)。不崩溃但结果错。</w:t>
+        <w:t>第二个%d输出随机垃圾值，每次可能不同。不报错但结果错。</w:t>
       </w:r>
     </w:p>
     <w:p>
@@ -303,7 +288,7 @@
           <w:color w:val="0000B4"/>
           <w:sz w:val="22"/>
         </w:rPr>
-        <w:t>C不检查参数数量是否匹配占位符，写代码要自己保证对应。</w:t>
+        <w:t>C不检查参数数量，写代码要自己保证对应。</w:t>
       </w:r>
     </w:p>
     <w:p/>
@@ -322,7 +307,7 @@
           <w:b w:val="0"/>
           <w:sz w:val="22"/>
         </w:rPr>
-        <w:t>ASCII码和%c</w:t>
+        <w:t>ASCII码：A=65,a=97,0=48。%c把整数当字符输出，%d当整数输出。</w:t>
       </w:r>
     </w:p>
     <w:p>
@@ -341,7 +326,7 @@
           <w:b w:val="0"/>
           <w:sz w:val="22"/>
         </w:rPr>
-        <w:t>int a=65; printf("%c",a);输出什么？</w:t>
+        <w:t>int a=65; printf("%c",a);输出？</w:t>
       </w:r>
     </w:p>
     <w:p>
@@ -361,7 +346,7 @@
           <w:color w:val="006400"/>
           <w:sz w:val="22"/>
         </w:rPr>
-        <w:t>A。ASCII码65对应大写字母A。</w:t>
+        <w:t>A。ASCII 65=A。</w:t>
       </w:r>
     </w:p>
     <w:p>
@@ -381,7 +366,7 @@
           <w:color w:val="0000B4"/>
           <w:sz w:val="22"/>
         </w:rPr>
-        <w:t>记住A=65,a=97,0=48。大写小写差32。</w:t>
+        <w:t>记住三个基准：A=65,a=97,0=48。大小写差32。</w:t>
       </w:r>
     </w:p>
     <w:p/>
@@ -400,7 +385,7 @@
           <w:b w:val="0"/>
           <w:sz w:val="22"/>
         </w:rPr>
-        <w:t>计算机如何解决问题</w:t>
+        <w:t>计算机思维：枚举法每次+1试，二分法每次砍一半。二分法前提是数据有序。</w:t>
       </w:r>
     </w:p>
     <w:p>
@@ -419,7 +404,7 @@
           <w:b w:val="0"/>
           <w:sz w:val="22"/>
         </w:rPr>
-        <w:t>枚举法和二分法的区别？1-1000猜数最坏几次？差多少倍？</w:t>
+        <w:t>枚举法和二分法区别？1-1000猜数最坏几次？差多少倍？</w:t>
       </w:r>
     </w:p>
     <w:p>
@@ -439,7 +424,7 @@
           <w:color w:val="006400"/>
           <w:sz w:val="22"/>
         </w:rPr>
-        <w:t>枚举每次+1最多1000次，二分每次砍半最多10次。差100倍。</w:t>
+        <w:t>枚举最多1000次，二分最多10次(2^10=1024)。差100倍。</w:t>
       </w:r>
     </w:p>
     <w:p>
@@ -459,7 +444,7 @@
           <w:color w:val="0000B4"/>
           <w:sz w:val="22"/>
         </w:rPr>
-        <w:t>二分法前提是数据有序。效率远高于枚举。</w:t>
+        <w:t>二分法效率高但前提是有序数据。</w:t>
       </w:r>
     </w:p>
     <w:p/>
@@ -478,7 +463,7 @@
           <w:b w:val="0"/>
           <w:sz w:val="22"/>
         </w:rPr>
-        <w:t>编译vs解释</w:t>
+        <w:t>编译(C)全部翻机器码执行快。解释(Python)逐行执行跨平台方便。</w:t>
       </w:r>
     </w:p>
     <w:p>
@@ -497,7 +482,7 @@
           <w:b w:val="0"/>
           <w:sz w:val="22"/>
         </w:rPr>
-        <w:t>编译和解释的核心区别？各举一个例子。</w:t>
+        <w:t>编译和解释的核心区别？举例。</w:t>
       </w:r>
     </w:p>
     <w:p>
@@ -517,7 +502,7 @@
           <w:color w:val="006400"/>
           <w:sz w:val="22"/>
         </w:rPr>
-        <w:t>编译(C)全部翻成机器码执行快。解释(Python)逐行执行跨平台方便。</w:t>
+        <w:t>编译(C)翻完再执行快。解释(Python)逐行执行跨平台方便。</w:t>
       </w:r>
     </w:p>
     <w:p>
@@ -537,7 +522,7 @@
           <w:color w:val="0000B4"/>
           <w:sz w:val="22"/>
         </w:rPr>
-        <w:t>编译适合高性能，解释适合快速开发跨平台。</w:t>
+        <w:t>编译适合高性能场景，解释适合快速开发。</w:t>
       </w:r>
     </w:p>
     <w:p/>
@@ -556,7 +541,7 @@
           <w:b w:val="0"/>
           <w:sz w:val="22"/>
         </w:rPr>
-        <w:t>C语言用途</w:t>
+        <w:t>C写OS/驱动/嵌入式，不常用于桌面应用(用C++/Java/C#)。</w:t>
       </w:r>
     </w:p>
     <w:p>
@@ -575,7 +560,7 @@
           <w:b w:val="0"/>
           <w:sz w:val="22"/>
         </w:rPr>
-        <w:t>判断：C主要用来开发桌面应用如Word浏览器。对/错？</w:t>
+        <w:t>判断：C主要开发桌面应用如Word？</w:t>
       </w:r>
     </w:p>
     <w:p>
@@ -595,7 +580,7 @@
           <w:color w:val="006400"/>
           <w:sz w:val="22"/>
         </w:rPr>
-        <w:t>错。C写OS/驱动/嵌入式。桌面用C++/Java/C#。</w:t>
+        <w:t>错。C写OS/驱动/嵌入式。</w:t>
       </w:r>
     </w:p>
     <w:p>
@@ -634,7 +619,7 @@
           <w:b w:val="0"/>
           <w:sz w:val="22"/>
         </w:rPr>
-        <w:t>C语言历史</w:t>
+        <w:t>1972年Dennis Ritchie贝尔实验室创造C。从B语言来。</w:t>
       </w:r>
     </w:p>
     <w:p>
@@ -653,7 +638,7 @@
           <w:b w:val="0"/>
           <w:sz w:val="22"/>
         </w:rPr>
-        <w:t>C语言谁在哪个实验室创造的？从哪个语言来？</w:t>
+        <w:t>C语言谁在哪创造？从哪个语言来？</w:t>
       </w:r>
     </w:p>
     <w:p>
@@ -673,7 +658,7 @@
           <w:color w:val="006400"/>
           <w:sz w:val="22"/>
         </w:rPr>
-        <w:t>Dennis Ritchie贝尔实验室1972年。从B语言来。</w:t>
+        <w:t>Dennis Ritchie，贝尔实验室。从B语言来。</w:t>
       </w:r>
     </w:p>
     <w:p>
@@ -712,7 +697,7 @@
           <w:b w:val="0"/>
           <w:sz w:val="22"/>
         </w:rPr>
-        <w:t>printf和占位符</w:t>
+        <w:t>printf格式和占位符。%d被后面的值替换。换行符是\n。</w:t>
       </w:r>
     </w:p>
     <w:p>
@@ -731,7 +716,7 @@
           <w:b w:val="0"/>
           <w:sz w:val="22"/>
         </w:rPr>
-        <w:t>printf("5+3=%d",5+3);输出什么？</w:t>
+        <w:t>printf("5+3=%d",5+3);输出？</w:t>
       </w:r>
     </w:p>
     <w:p>
@@ -771,7 +756,7 @@
           <w:color w:val="0000B4"/>
           <w:sz w:val="22"/>
         </w:rPr>
-        <w:t>区分：printf("%d",5+3);只输出8。</w:t>
+        <w:t>不是只输出8，%d被替换到字符串中。</w:t>
       </w:r>
     </w:p>
     <w:p/>
@@ -790,7 +775,7 @@
           <w:b w:val="0"/>
           <w:sz w:val="22"/>
         </w:rPr>
-        <w:t>#include预处理</w:t>
+        <w:t>#include &lt;stdio.h&gt;把stdio.h复制粘贴。里面声明了printf/scanf。</w:t>
       </w:r>
     </w:p>
     <w:p>
@@ -829,7 +814,7 @@
           <w:color w:val="006400"/>
           <w:sz w:val="22"/>
         </w:rPr>
-        <w:t>现代编译器报错。没有stdio.h声明，编译器不认识printf。</w:t>
+        <w:t>现代编译器报错。不认识printf。</w:t>
       </w:r>
     </w:p>
     <w:p>
@@ -849,7 +834,7 @@
           <w:color w:val="0000B4"/>
           <w:sz w:val="22"/>
         </w:rPr>
-        <w:t>虽然只是复制粘贴，但提供了编译器识别printf的前提。</w:t>
+        <w:t>没有声明编译器不知道printf怎么调。</w:t>
       </w:r>
     </w:p>
     <w:p/>
@@ -868,7 +853,7 @@
           <w:b w:val="0"/>
           <w:sz w:val="22"/>
         </w:rPr>
-        <w:t>printf多传参数</w:t>
+        <w:t>printf多传的参数被忽略，不看</w:t>
       </w:r>
     </w:p>
     <w:p>
@@ -887,7 +872,7 @@
           <w:b w:val="0"/>
           <w:sz w:val="22"/>
         </w:rPr>
-        <w:t>printf("%d",10,20);多传一个参数会怎样？</w:t>
+        <w:t>printf("%d",10,20);多传参数会怎样？</w:t>
       </w:r>
     </w:p>
     <w:p>
@@ -907,7 +892,7 @@
           <w:color w:val="006400"/>
           <w:sz w:val="22"/>
         </w:rPr>
-        <w:t>忽略。正常输出10。不报错。</w:t>
+        <w:t>忽略。正常输出10。</w:t>
       </w:r>
     </w:p>
     <w:p>
@@ -927,7 +912,7 @@
           <w:color w:val="0000B4"/>
           <w:sz w:val="22"/>
         </w:rPr>
-        <w:t>虽然多传不报错，但应保持占位符和参数一致。</w:t>
+        <w:t>虽然不报错但应保持占位符和参数一致。</w:t>
       </w:r>
     </w:p>
     <w:p/>
@@ -946,8 +931,7 @@
           <w:b w:val="0"/>
           <w:sz w:val="22"/>
         </w:rPr>
-        <w:t>换行符</w:t>
-        <w:br/>
+        <w:t>\n=换行符。不写两次输出接在一起。</w:t>
       </w:r>
     </w:p>
     <w:p>
@@ -966,9 +950,7 @@
           <w:b w:val="0"/>
           <w:sz w:val="22"/>
         </w:rPr>
-        <w:t>printf("Hello");printf("World");不写</w:t>
-        <w:br/>
-        <w:t>输出？</w:t>
+        <w:t>printf("Hello");printf("World");不写\n输出？</w:t>
       </w:r>
     </w:p>
     <w:p>
@@ -1008,11 +990,9 @@
           <w:color w:val="0000B4"/>
           <w:sz w:val="22"/>
         </w:rPr>
-        <w:br/>
-        <w:t>=换行符。</w:t>
+        <w:t>\n=换行相当于按回车。</w:t>
       </w:r>
     </w:p>
-    <w:p/>
     <w:p/>
     <w:p>
       <w:pPr>
@@ -1026,7 +1006,7 @@
           <w:color w:val="003366"/>
           <w:sz w:val="36"/>
         </w:rPr>
-        <w:t>第2章 计算</w:t>
+        <w:t>第2章  计算</w:t>
       </w:r>
     </w:p>
     <w:p>
@@ -1037,7 +1017,7 @@
           <w:color w:val="B40000"/>
           <w:sz w:val="20"/>
         </w:rPr>
-        <w:t>答错题排在前面，答对题排在后面。</w:t>
+        <w:t>答错排前，答对排后。</w:t>
       </w:r>
     </w:p>
     <w:p/>
@@ -1056,7 +1036,7 @@
           <w:b w:val="0"/>
           <w:sz w:val="22"/>
         </w:rPr>
-        <w:t>整数除法（极重要）</w:t>
+        <w:t>整数除法：int/int=int，小数丢掉不四舍五入。至少一边浮点才得小数。</w:t>
       </w:r>
     </w:p>
     <w:p>
@@ -1095,7 +1075,7 @@
           <w:color w:val="006400"/>
           <w:sz w:val="22"/>
         </w:rPr>
-        <w:t>a=3,b=3.0(先整除得3再转double),c=3.333...(浮点除法)</w:t>
+        <w:t>a=3,b=3.0(先整数除法得3再转double),c=3.333...(浮点除法)</w:t>
       </w:r>
     </w:p>
     <w:p>
@@ -1115,7 +1095,7 @@
           <w:color w:val="0000B4"/>
           <w:sz w:val="22"/>
         </w:rPr>
-        <w:t>int/int=int。想要小数至少一边写10.0</w:t>
+        <w:t>int/int结果必是int。想要小数至少一边写10.0。</w:t>
       </w:r>
     </w:p>
     <w:p/>
@@ -1134,7 +1114,7 @@
           <w:b w:val="0"/>
           <w:sz w:val="22"/>
         </w:rPr>
-        <w:t>float和double区别</w:t>
+        <w:t>float=4B(6-7位精度)，double=8B(15-16位精度)。double更准但多占内存。</w:t>
       </w:r>
     </w:p>
     <w:p>
@@ -1153,7 +1133,7 @@
           <w:b w:val="0"/>
           <w:sz w:val="22"/>
         </w:rPr>
-        <w:t>float和double有什么区别？</w:t>
+        <w:t>float和double区别？</w:t>
       </w:r>
     </w:p>
     <w:p>
@@ -1173,7 +1153,7 @@
           <w:color w:val="006400"/>
           <w:sz w:val="22"/>
         </w:rPr>
-        <w:t>float=4B(6-7位),double=8B(15-16位)。double更准但占多一倍内存。</w:t>
+        <w:t>float=4B(6-7位)，double=8B(15-16位)。double更准。</w:t>
       </w:r>
     </w:p>
     <w:p>
@@ -1212,7 +1192,7 @@
           <w:b w:val="0"/>
           <w:sz w:val="22"/>
         </w:rPr>
-        <w:t>scanf %f和%lf</w:t>
+        <w:t>printf double用%f(与float共用)。scanf double必须用%lf！</w:t>
       </w:r>
     </w:p>
     <w:p>
@@ -1271,7 +1251,7 @@
           <w:color w:val="0000B4"/>
           <w:sz w:val="22"/>
         </w:rPr>
-        <w:t>printf用%f输出double(提升规则),但scanf必须区分。</w:t>
+        <w:t>printf可以用%f输出double(提升规则)，但scanf必须区分。</w:t>
       </w:r>
     </w:p>
     <w:p/>
@@ -1290,7 +1270,7 @@
           <w:b w:val="0"/>
           <w:sz w:val="22"/>
         </w:rPr>
-        <w:t>取余运算符%</w:t>
+        <w:t>%=取余数。10%3=1。a%2判奇偶，n%10取个位。</w:t>
       </w:r>
     </w:p>
     <w:p>
@@ -1349,7 +1329,7 @@
           <w:color w:val="0000B4"/>
           <w:sz w:val="22"/>
         </w:rPr>
-        <w:t>%=除完拿余数。7%10=7不是0(因为7/10=0余7)</w:t>
+        <w:t>7%10=7不是0(7/10=0余7)。%只能用于整数。</w:t>
       </w:r>
     </w:p>
     <w:p/>
@@ -1368,7 +1348,7 @@
           <w:b w:val="0"/>
           <w:sz w:val="22"/>
         </w:rPr>
-        <w:t>%c和ASCII</w:t>
+        <w:t>同12题。ASCII码65=A。%c输出字符。</w:t>
       </w:r>
     </w:p>
     <w:p>
@@ -1427,7 +1407,7 @@
           <w:color w:val="0000B4"/>
           <w:sz w:val="22"/>
         </w:rPr>
-        <w:t>同第12题。记住A=65,a=97,0=48。</w:t>
+        <w:t>和12题相同知识点。</w:t>
       </w:r>
     </w:p>
     <w:p/>
@@ -1446,7 +1426,7 @@
           <w:b w:val="0"/>
           <w:sz w:val="22"/>
         </w:rPr>
-        <w:t>赋值=不是等于</w:t>
+        <w:t>=是赋值不是等号，先右后左。x=y把y的值复制给x。交换必须用临时变量。</w:t>
       </w:r>
     </w:p>
     <w:p>
@@ -1465,7 +1445,7 @@
           <w:b w:val="0"/>
           <w:sz w:val="22"/>
         </w:rPr>
-        <w:t>int x=10,y=20; x=y; y=x; 输出x和y？</w:t>
+        <w:t>int x=10,y=20; x=y; y=x;输出x和y？</w:t>
       </w:r>
     </w:p>
     <w:p>
@@ -1505,7 +1485,7 @@
           <w:color w:val="0000B4"/>
           <w:sz w:val="22"/>
         </w:rPr>
-        <w:t>交换必须用临时变量temp=a;a=b;b=temp;</w:t>
+        <w:t>交换必须temp=a;a=b;b=temp;。x=y=y=x不能交换。</w:t>
       </w:r>
     </w:p>
     <w:p/>
@@ -1524,7 +1504,7 @@
           <w:b w:val="0"/>
           <w:sz w:val="22"/>
         </w:rPr>
-        <w:t>a++和++a</w:t>
+        <w:t>a++先用后加(先取值再+1)。++a先加后用(先+1再取值)。</w:t>
       </w:r>
     </w:p>
     <w:p>
@@ -1563,7 +1543,7 @@
           <w:color w:val="006400"/>
           <w:sz w:val="22"/>
         </w:rPr>
-        <w:t>a=6,b=5。a++先用后加(b拿加之前的值)。</w:t>
+        <w:t>a=6,b=5。a++先用后加，b拿到加之前的值5。</w:t>
       </w:r>
     </w:p>
     <w:p>
@@ -1602,7 +1582,7 @@
           <w:b w:val="0"/>
           <w:sz w:val="22"/>
         </w:rPr>
-        <w:t>运算符优先级</w:t>
+        <w:t>优先级(高到低)：++-- &gt; * / % &gt; + - &gt; =。同级左结合。括号最高。</w:t>
       </w:r>
     </w:p>
     <w:p>
@@ -1621,7 +1601,7 @@
           <w:b w:val="0"/>
           <w:sz w:val="22"/>
         </w:rPr>
-        <w:t>int a=5+3*2; a=? int b=(5+3)*2; b=?</w:t>
+        <w:t>int a=5+3*2; a=? int b=(5+3)*2; b=? int c=20/4*2; c=? int d=20/(4*2); d=?</w:t>
       </w:r>
     </w:p>
     <w:p>
@@ -1641,7 +1621,7 @@
           <w:color w:val="006400"/>
           <w:sz w:val="22"/>
         </w:rPr>
-        <w:t>a=11(*先于+),b=16(括号优先)</w:t>
+        <w:t>a=11(*先于+),b=16(括号优先),c=10(左结合),d=2(括号优先)</w:t>
       </w:r>
     </w:p>
     <w:p>
@@ -1661,7 +1641,7 @@
           <w:color w:val="0000B4"/>
           <w:sz w:val="22"/>
         </w:rPr>
-        <w:t>*高于+，括号改变优先级。记不住就用括号。</w:t>
+        <w:t>记不住优先级就用括号。20/4*2从左到右=10。</w:t>
       </w:r>
     </w:p>
     <w:p/>
@@ -1680,7 +1660,7 @@
           <w:b w:val="0"/>
           <w:sz w:val="22"/>
         </w:rPr>
-        <w:t>printf/scanf double格式</w:t>
+        <w:t>printf double用%f(与float共用格式)。scanf double才用%lf。</w:t>
       </w:r>
     </w:p>
     <w:p>
@@ -1699,7 +1679,7 @@
           <w:b w:val="0"/>
           <w:sz w:val="22"/>
         </w:rPr>
-        <w:t>判断：printf输出double应该用%lf。对/错？</w:t>
+        <w:t>判断：printf输出double用%lf？</w:t>
       </w:r>
     </w:p>
     <w:p>
@@ -1719,7 +1699,7 @@
           <w:color w:val="006400"/>
           <w:sz w:val="22"/>
         </w:rPr>
-        <w:t>错。printf double用%f。scanf double才用%lf。</w:t>
+        <w:t>错。printf用%f，scanf才用%lf。</w:t>
       </w:r>
     </w:p>
     <w:p>
@@ -1739,7 +1719,7 @@
           <w:color w:val="0000B4"/>
           <w:sz w:val="22"/>
         </w:rPr>
-        <w:t>考试常考：输出统一%f，输入区分%f和%lf。</w:t>
+        <w:t>输出统一%f，输入区分%f和%lf。考试常考。</w:t>
       </w:r>
     </w:p>
     <w:p/>
@@ -1758,7 +1738,7 @@
           <w:b w:val="0"/>
           <w:sz w:val="22"/>
         </w:rPr>
-        <w:t>加减法交换变量</w:t>
+        <w:t>加减法可交换a=a+b;b=a-b;a=a-b。但不推荐(可读性差)。</w:t>
       </w:r>
     </w:p>
     <w:p>
@@ -1777,7 +1757,7 @@
           <w:b w:val="0"/>
           <w:sz w:val="22"/>
         </w:rPr>
-        <w:t>不用新变量交换a=3和b=5的值。</w:t>
+        <w:t>用加减法交换a=3,b=5(不用新变量)。</w:t>
       </w:r>
     </w:p>
     <w:p>
@@ -1797,7 +1777,7 @@
           <w:color w:val="006400"/>
           <w:sz w:val="22"/>
         </w:rPr>
-        <w:t>a=a+b;b=a-b;a=a-b; 结果a=5,b=3。</w:t>
+        <w:t>a=a+b=8;b=a-b=3;a=a-b=5。结果a=5,b=3。</w:t>
       </w:r>
     </w:p>
     <w:p>
@@ -1817,7 +1797,7 @@
           <w:color w:val="0000B4"/>
           <w:sz w:val="22"/>
         </w:rPr>
-        <w:t>知道就行，实际用临时变量更清晰安全。</w:t>
+        <w:t>知道就行，实际用临时变量更清晰。</w:t>
       </w:r>
     </w:p>
     <w:p/>
@@ -1836,7 +1816,7 @@
           <w:b w:val="0"/>
           <w:sz w:val="22"/>
         </w:rPr>
-        <w:t>++a前缀自增</w:t>
+        <w:t>++a先加后用。int c=5;d=++c;先c变6再给d。</w:t>
       </w:r>
     </w:p>
     <w:p>
@@ -1895,7 +1875,7 @@
           <w:color w:val="0000B4"/>
           <w:sz w:val="22"/>
         </w:rPr>
-        <w:t>区分：a++先用后加vs++a先加后用。</w:t>
+        <w:t>区分：a++先用后加 vs ++a先加后用。</w:t>
       </w:r>
     </w:p>
     <w:p/>
@@ -1914,7 +1894,7 @@
           <w:b w:val="0"/>
           <w:sz w:val="22"/>
         </w:rPr>
-        <w:t>复合赋值</w:t>
+        <w:t>复合赋值：x+=y等价x=x+y。注意total*=sum+1等价total=total*(sum+1)。</w:t>
       </w:r>
     </w:p>
     <w:p>
@@ -1933,7 +1913,7 @@
           <w:b w:val="0"/>
           <w:sz w:val="22"/>
         </w:rPr>
-        <w:t>int x=5; x+=3; x=?</w:t>
+        <w:t>int x=5; x+=3; x=?   展开total*=sum+1</w:t>
       </w:r>
     </w:p>
     <w:p>
@@ -1953,7 +1933,7 @@
           <w:color w:val="006400"/>
           <w:sz w:val="22"/>
         </w:rPr>
-        <w:t>x=8。x+=3等价x=x+3=5+3=8。</w:t>
+        <w:t>x=8。x+=3等价x=x+3。total*=sum+1等价total=total*(sum+1)。</w:t>
       </w:r>
     </w:p>
     <w:p>
@@ -1973,7 +1953,7 @@
           <w:color w:val="0000B4"/>
           <w:sz w:val="22"/>
         </w:rPr>
-        <w:t>x+=y等价x=x+y。注意运算顺序：整个右边先算。</w:t>
+        <w:t>复合赋值更简洁但注意运算顺序：整个右边先算。</w:t>
       </w:r>
     </w:p>
     <w:p/>
@@ -1990,7 +1970,17 @@
           <w:color w:val="003366"/>
           <w:sz w:val="28"/>
         </w:rPr>
-        <w:t>总结</w:t>
+        <w:t>统计</w:t>
+      </w:r>
+    </w:p>
+    <w:p>
+      <w:r>
+        <w:rPr>
+          <w:rFonts w:eastAsia="SimHei"/>
+          <w:b/>
+          <w:sz w:val="24"/>
+        </w:rPr>
+        <w:t>答对12题  答错12题  共24题</w:t>
       </w:r>
     </w:p>
     <w:p>
@@ -2000,116 +1990,7 @@
           <w:b w:val="0"/>
           <w:sz w:val="22"/>
         </w:rPr>
-        <w:t>第1章：计算机思维 -&gt; C语言历史 -&gt; 程序框架 -&gt; printf/占位符</w:t>
-      </w:r>
-    </w:p>
-    <w:p>
-      <w:r>
-        <w:rPr>
-          <w:rFonts w:eastAsia="SimSun"/>
-          <w:b w:val="0"/>
-          <w:sz w:val="22"/>
-        </w:rPr>
-        <w:t>第2章：变量 -&gt; 数据类型 -&gt; scanf -&gt; 运算符(整数除法/取余/a++) -&gt; 交换变量</w:t>
-      </w:r>
-    </w:p>
-    <w:p/>
-    <w:p>
-      <w:r>
-        <w:rPr>
-          <w:rFonts w:eastAsia="SimHei"/>
-          <w:b/>
-          <w:sz w:val="24"/>
-        </w:rPr>
-        <w:t>答错的12题集中在：</w:t>
-      </w:r>
-    </w:p>
-    <w:p>
-      <w:r>
-        <w:rPr>
-          <w:rFonts w:eastAsia="SimSun"/>
-          <w:b w:val="0"/>
-          <w:color w:val="C80000"/>
-          <w:sz w:val="22"/>
-        </w:rPr>
-        <w:t>1. 整数除法陷阱(10/3=3不是3.3)</w:t>
-      </w:r>
-    </w:p>
-    <w:p>
-      <w:r>
-        <w:rPr>
-          <w:rFonts w:eastAsia="SimSun"/>
-          <w:b w:val="0"/>
-          <w:color w:val="C80000"/>
-          <w:sz w:val="22"/>
-        </w:rPr>
-        <w:t>2. 赋值和交换(x=y后两个数相同)</w:t>
-      </w:r>
-    </w:p>
-    <w:p>
-      <w:r>
-        <w:rPr>
-          <w:rFonts w:eastAsia="SimSun"/>
-          <w:b w:val="0"/>
-          <w:color w:val="C80000"/>
-          <w:sz w:val="22"/>
-        </w:rPr>
-        <w:t>3. a++和++a区分</w:t>
-      </w:r>
-    </w:p>
-    <w:p>
-      <w:r>
-        <w:rPr>
-          <w:rFonts w:eastAsia="SimSun"/>
-          <w:b w:val="0"/>
-          <w:color w:val="C80000"/>
-          <w:sz w:val="22"/>
-        </w:rPr>
-        <w:t>4. double的scanf必须用%lf</w:t>
-      </w:r>
-    </w:p>
-    <w:p>
-      <w:r>
-        <w:rPr>
-          <w:rFonts w:eastAsia="SimSun"/>
-          <w:b w:val="0"/>
-          <w:color w:val="C80000"/>
-          <w:sz w:val="22"/>
-        </w:rPr>
-        <w:t>5. ASCII码和%c输出</w:t>
-      </w:r>
-    </w:p>
-    <w:p>
-      <w:r>
-        <w:rPr>
-          <w:rFonts w:eastAsia="SimSun"/>
-          <w:b w:val="0"/>
-          <w:color w:val="C80000"/>
-          <w:sz w:val="22"/>
-        </w:rPr>
-        <w:t>6. printf参数匹配(少传出垃圾值)</w:t>
-      </w:r>
-    </w:p>
-    <w:p>
-      <w:r>
-        <w:rPr>
-          <w:rFonts w:eastAsia="SimSun"/>
-          <w:b w:val="0"/>
-          <w:color w:val="C80000"/>
-          <w:sz w:val="22"/>
-        </w:rPr>
-        <w:t>7. return 0含义(返回给OS不是输出)</w:t>
-      </w:r>
-    </w:p>
-    <w:p>
-      <w:r>
-        <w:rPr>
-          <w:rFonts w:eastAsia="SimSun"/>
-          <w:b w:val="0"/>
-          <w:color w:val="C80000"/>
-          <w:sz w:val="22"/>
-        </w:rPr>
-        <w:t>8. 运算符优先级(*/高于+-)</w:t>
+        <w:t>答错知识点：main大小写 | return 0 | printf参数匹配 | ASCII码 | 整数除法 | float/double | scanf%lf | 取余 | 赋值陷阱 | a++/++a | 运算符优先级</w:t>
       </w:r>
     </w:p>
     <w:sectPr>

</xml_diff>